<commit_message>
Added the first half of lesson 2
Inserted permissions, groups, owner
</commit_message>
<xml_diff>
--- a/University/Laboratorio di Sistemi Operativi.docx
+++ b/University/Laboratorio di Sistemi Operativi.docx
@@ -332,7 +332,7 @@
           <w:r>
             <w:fldChar w:fldCharType="separate"/>
           </w:r>
-          <w:hyperlink w:anchor="_Toc179919945" w:history="1">
+          <w:hyperlink w:anchor="_Toc180065564" w:history="1">
             <w:r>
               <w:rPr>
                 <w:rStyle w:val="Collegamentoipertestuale"/>
@@ -359,7 +359,7 @@
                 <w:noProof/>
                 <w:webHidden/>
               </w:rPr>
-              <w:instrText xml:space="preserve"> PAGEREF _Toc179919945 \h </w:instrText>
+              <w:instrText xml:space="preserve"> PAGEREF _Toc180065564 \h </w:instrText>
             </w:r>
             <w:r>
               <w:rPr>
@@ -403,7 +403,7 @@
               <w:lang w:eastAsia="ja-JP"/>
             </w:rPr>
           </w:pPr>
-          <w:hyperlink w:anchor="_Toc179919946" w:history="1">
+          <w:hyperlink w:anchor="_Toc180065565" w:history="1">
             <w:r>
               <w:rPr>
                 <w:rStyle w:val="Collegamentoipertestuale"/>
@@ -430,7 +430,7 @@
                 <w:noProof/>
                 <w:webHidden/>
               </w:rPr>
-              <w:instrText xml:space="preserve"> PAGEREF _Toc179919946 \h </w:instrText>
+              <w:instrText xml:space="preserve"> PAGEREF _Toc180065565 \h </w:instrText>
             </w:r>
             <w:r>
               <w:rPr>
@@ -474,7 +474,7 @@
               <w:lang w:eastAsia="ja-JP"/>
             </w:rPr>
           </w:pPr>
-          <w:hyperlink w:anchor="_Toc179919947" w:history="1">
+          <w:hyperlink w:anchor="_Toc180065566" w:history="1">
             <w:r>
               <w:rPr>
                 <w:rStyle w:val="Collegamentoipertestuale"/>
@@ -501,7 +501,7 @@
                 <w:noProof/>
                 <w:webHidden/>
               </w:rPr>
-              <w:instrText xml:space="preserve"> PAGEREF _Toc179919947 \h </w:instrText>
+              <w:instrText xml:space="preserve"> PAGEREF _Toc180065566 \h </w:instrText>
             </w:r>
             <w:r>
               <w:rPr>
@@ -545,7 +545,7 @@
               <w:lang w:eastAsia="ja-JP"/>
             </w:rPr>
           </w:pPr>
-          <w:hyperlink w:anchor="_Toc179919948" w:history="1">
+          <w:hyperlink w:anchor="_Toc180065567" w:history="1">
             <w:r>
               <w:rPr>
                 <w:rStyle w:val="Collegamentoipertestuale"/>
@@ -572,7 +572,7 @@
                 <w:noProof/>
                 <w:webHidden/>
               </w:rPr>
-              <w:instrText xml:space="preserve"> PAGEREF _Toc179919948 \h </w:instrText>
+              <w:instrText xml:space="preserve"> PAGEREF _Toc180065567 \h </w:instrText>
             </w:r>
             <w:r>
               <w:rPr>
@@ -616,7 +616,7 @@
               <w:lang w:eastAsia="ja-JP"/>
             </w:rPr>
           </w:pPr>
-          <w:hyperlink w:anchor="_Toc179919949" w:history="1">
+          <w:hyperlink w:anchor="_Toc180065568" w:history="1">
             <w:r>
               <w:rPr>
                 <w:rStyle w:val="Collegamentoipertestuale"/>
@@ -643,7 +643,7 @@
                 <w:noProof/>
                 <w:webHidden/>
               </w:rPr>
-              <w:instrText xml:space="preserve"> PAGEREF _Toc179919949 \h </w:instrText>
+              <w:instrText xml:space="preserve"> PAGEREF _Toc180065568 \h </w:instrText>
             </w:r>
             <w:r>
               <w:rPr>
@@ -687,7 +687,7 @@
               <w:lang w:eastAsia="ja-JP"/>
             </w:rPr>
           </w:pPr>
-          <w:hyperlink w:anchor="_Toc179919950" w:history="1">
+          <w:hyperlink w:anchor="_Toc180065569" w:history="1">
             <w:r>
               <w:rPr>
                 <w:rStyle w:val="Collegamentoipertestuale"/>
@@ -714,78 +714,7 @@
                 <w:noProof/>
                 <w:webHidden/>
               </w:rPr>
-              <w:instrText xml:space="preserve"> PAGEREF _Toc179919950 \h </w:instrText>
-            </w:r>
-            <w:r>
-              <w:rPr>
-                <w:noProof/>
-                <w:webHidden/>
-              </w:rPr>
-            </w:r>
-            <w:r>
-              <w:rPr>
-                <w:noProof/>
-                <w:webHidden/>
-              </w:rPr>
-              <w:fldChar w:fldCharType="separate"/>
-            </w:r>
-            <w:r>
-              <w:rPr>
-                <w:noProof/>
-                <w:webHidden/>
-              </w:rPr>
-              <w:t>5</w:t>
-            </w:r>
-            <w:r>
-              <w:rPr>
-                <w:noProof/>
-                <w:webHidden/>
-              </w:rPr>
-              <w:fldChar w:fldCharType="end"/>
-            </w:r>
-          </w:hyperlink>
-        </w:p>
-        <w:p>
-          <w:pPr>
-            <w:pStyle w:val="Sommario1"/>
-            <w:tabs>
-              <w:tab w:val="right" w:leader="dot" w:pos="9628"/>
-            </w:tabs>
-            <w:rPr>
-              <w:rFonts w:eastAsiaTheme="minorEastAsia"/>
-              <w:noProof/>
-              <w:szCs w:val="24"/>
-              <w:lang w:eastAsia="ja-JP"/>
-            </w:rPr>
-          </w:pPr>
-          <w:hyperlink w:anchor="_Toc179919951" w:history="1">
-            <w:r>
-              <w:rPr>
-                <w:rStyle w:val="Collegamentoipertestuale"/>
-                <w:noProof/>
-              </w:rPr>
-              <w:t>2. [LEZIONE 2] [BETA]</w:t>
-            </w:r>
-            <w:r>
-              <w:rPr>
-                <w:noProof/>
-                <w:webHidden/>
-              </w:rPr>
-              <w:tab/>
-            </w:r>
-            <w:r>
-              <w:rPr>
-                <w:noProof/>
-                <w:webHidden/>
-              </w:rPr>
-              <w:fldChar w:fldCharType="begin"/>
-            </w:r>
-            <w:r>
-              <w:rPr>
-                <w:noProof/>
-                <w:webHidden/>
-              </w:rPr>
-              <w:instrText xml:space="preserve"> PAGEREF _Toc179919951 \h </w:instrText>
+              <w:instrText xml:space="preserve"> PAGEREF _Toc180065569 \h </w:instrText>
             </w:r>
             <w:r>
               <w:rPr>
@@ -817,6 +746,144 @@
           </w:hyperlink>
         </w:p>
         <w:p>
+          <w:pPr>
+            <w:pStyle w:val="Sommario2"/>
+            <w:tabs>
+              <w:tab w:val="right" w:leader="dot" w:pos="9628"/>
+            </w:tabs>
+            <w:rPr>
+              <w:rFonts w:eastAsiaTheme="minorEastAsia"/>
+              <w:noProof/>
+              <w:szCs w:val="24"/>
+              <w:lang w:eastAsia="ja-JP"/>
+            </w:rPr>
+          </w:pPr>
+          <w:hyperlink w:anchor="_Toc180065570" w:history="1">
+            <w:r>
+              <w:rPr>
+                <w:rStyle w:val="Collegamentoipertestuale"/>
+                <w:noProof/>
+              </w:rPr>
+              <w:t>1.3 Permessi e Protezione file</w:t>
+            </w:r>
+            <w:r>
+              <w:rPr>
+                <w:noProof/>
+                <w:webHidden/>
+              </w:rPr>
+              <w:tab/>
+            </w:r>
+            <w:r>
+              <w:rPr>
+                <w:noProof/>
+                <w:webHidden/>
+              </w:rPr>
+              <w:fldChar w:fldCharType="begin"/>
+            </w:r>
+            <w:r>
+              <w:rPr>
+                <w:noProof/>
+                <w:webHidden/>
+              </w:rPr>
+              <w:instrText xml:space="preserve"> PAGEREF _Toc180065570 \h </w:instrText>
+            </w:r>
+            <w:r>
+              <w:rPr>
+                <w:noProof/>
+                <w:webHidden/>
+              </w:rPr>
+            </w:r>
+            <w:r>
+              <w:rPr>
+                <w:noProof/>
+                <w:webHidden/>
+              </w:rPr>
+              <w:fldChar w:fldCharType="separate"/>
+            </w:r>
+            <w:r>
+              <w:rPr>
+                <w:noProof/>
+                <w:webHidden/>
+              </w:rPr>
+              <w:t>6</w:t>
+            </w:r>
+            <w:r>
+              <w:rPr>
+                <w:noProof/>
+                <w:webHidden/>
+              </w:rPr>
+              <w:fldChar w:fldCharType="end"/>
+            </w:r>
+          </w:hyperlink>
+        </w:p>
+        <w:p>
+          <w:pPr>
+            <w:pStyle w:val="Sommario1"/>
+            <w:tabs>
+              <w:tab w:val="right" w:leader="dot" w:pos="9628"/>
+            </w:tabs>
+            <w:rPr>
+              <w:rFonts w:eastAsiaTheme="minorEastAsia"/>
+              <w:noProof/>
+              <w:szCs w:val="24"/>
+              <w:lang w:eastAsia="ja-JP"/>
+            </w:rPr>
+          </w:pPr>
+          <w:hyperlink w:anchor="_Toc180065571" w:history="1">
+            <w:r>
+              <w:rPr>
+                <w:rStyle w:val="Collegamentoipertestuale"/>
+                <w:noProof/>
+              </w:rPr>
+              <w:t>2. [LEZIONE 2] [BETA]</w:t>
+            </w:r>
+            <w:r>
+              <w:rPr>
+                <w:noProof/>
+                <w:webHidden/>
+              </w:rPr>
+              <w:tab/>
+            </w:r>
+            <w:r>
+              <w:rPr>
+                <w:noProof/>
+                <w:webHidden/>
+              </w:rPr>
+              <w:fldChar w:fldCharType="begin"/>
+            </w:r>
+            <w:r>
+              <w:rPr>
+                <w:noProof/>
+                <w:webHidden/>
+              </w:rPr>
+              <w:instrText xml:space="preserve"> PAGEREF _Toc180065571 \h </w:instrText>
+            </w:r>
+            <w:r>
+              <w:rPr>
+                <w:noProof/>
+                <w:webHidden/>
+              </w:rPr>
+              <w:fldChar w:fldCharType="separate"/>
+            </w:r>
+            <w:r>
+              <w:rPr>
+                <w:b/>
+                <w:bCs/>
+                <w:noProof/>
+                <w:webHidden/>
+              </w:rPr>
+              <w:t>Errore. Il segnalibro non è definito.</w:t>
+            </w:r>
+            <w:r>
+              <w:rPr>
+                <w:noProof/>
+                <w:webHidden/>
+              </w:rPr>
+              <w:fldChar w:fldCharType="end"/>
+            </w:r>
+          </w:hyperlink>
+        </w:p>
+        <w:p>
           <w:r>
             <w:rPr>
               <w:b/>
@@ -838,7 +905,7 @@
       <w:pPr>
         <w:pStyle w:val="Titolo1"/>
       </w:pPr>
-      <w:bookmarkStart w:id="0" w:name="_Toc179919945"/>
+      <w:bookmarkStart w:id="0" w:name="_Toc180065564"/>
       <w:r>
         <w:lastRenderedPageBreak/>
         <w:t>0. Premessa</w:t>
@@ -926,7 +993,7 @@
       <w:pPr>
         <w:pStyle w:val="Titolo2"/>
       </w:pPr>
-      <w:bookmarkStart w:id="1" w:name="_Toc179919946"/>
+      <w:bookmarkStart w:id="1" w:name="_Toc180065565"/>
       <w:r>
         <w:t>0.1 Riferimenti</w:t>
       </w:r>
@@ -1252,7 +1319,7 @@
       <w:pPr>
         <w:pStyle w:val="Titolo2"/>
       </w:pPr>
-      <w:bookmarkStart w:id="2" w:name="_Toc179919947"/>
+      <w:bookmarkStart w:id="2" w:name="_Toc180065566"/>
       <w:r>
         <w:t>0.2 Info e Contatti</w:t>
       </w:r>
@@ -1389,7 +1456,7 @@
       <w:pPr>
         <w:pStyle w:val="Titolo1"/>
       </w:pPr>
-      <w:bookmarkStart w:id="3" w:name="_Toc179919948"/>
+      <w:bookmarkStart w:id="3" w:name="_Toc180065567"/>
       <w:r>
         <w:lastRenderedPageBreak/>
         <w:t>1.</w:t>
@@ -1767,7 +1834,7 @@
       <w:pPr>
         <w:pStyle w:val="Titolo2"/>
       </w:pPr>
-      <w:bookmarkStart w:id="4" w:name="_Toc179919949"/>
+      <w:bookmarkStart w:id="4" w:name="_Toc180065568"/>
       <w:r>
         <w:t>1.1 Comandi Unix</w:t>
       </w:r>
@@ -1799,6 +1866,7 @@
       <w:tblPr>
         <w:tblStyle w:val="Tabellasemplice4"/>
         <w:tblW w:w="0" w:type="auto"/>
+        <w:tblLayout w:type="fixed"/>
         <w:tblLook w:val="04A0" w:firstRow="1" w:lastRow="0" w:firstColumn="1" w:lastColumn="0" w:noHBand="0" w:noVBand="1"/>
       </w:tblPr>
       <w:tblGrid>
@@ -2372,10 +2440,69 @@
           </w:p>
         </w:tc>
       </w:tr>
+      <w:tr>
+        <w:trPr>
+          <w:trHeight w:val="340"/>
+        </w:trPr>
+        <w:tc>
+          <w:tcPr>
+            <w:cnfStyle w:val="001000000000" w:firstRow="0" w:lastRow="0" w:firstColumn="1" w:lastColumn="0" w:oddVBand="0" w:evenVBand="0" w:oddHBand="0" w:evenHBand="0" w:firstRowFirstColumn="0" w:firstRowLastColumn="0" w:lastRowFirstColumn="0" w:lastRowLastColumn="0"/>
+            <w:tcW w:w="1838" w:type="dxa"/>
+            <w:shd w:val="clear" w:color="auto" w:fill="auto"/>
+          </w:tcPr>
+          <w:p>
+            <w:pPr>
+              <w:rPr>
+                <w:rFonts w:ascii="Aptos Narrow" w:hAnsi="Aptos Narrow"/>
+                <w:i/>
+                <w:iCs/>
+              </w:rPr>
+            </w:pPr>
+            <w:r>
+              <w:rPr>
+                <w:rFonts w:ascii="Aptos Narrow" w:hAnsi="Aptos Narrow"/>
+                <w:i/>
+                <w:iCs/>
+              </w:rPr>
+              <w:t>du</w:t>
+            </w:r>
+          </w:p>
+        </w:tc>
+        <w:tc>
+          <w:tcPr>
+            <w:tcW w:w="7790" w:type="dxa"/>
+            <w:shd w:val="clear" w:color="auto" w:fill="auto"/>
+          </w:tcPr>
+          <w:p>
+            <w:pPr>
+              <w:cnfStyle w:val="000000000000" w:firstRow="0" w:lastRow="0" w:firstColumn="0" w:lastColumn="0" w:oddVBand="0" w:evenVBand="0" w:oddHBand="0" w:evenHBand="0" w:firstRowFirstColumn="0" w:firstRowLastColumn="0" w:lastRowFirstColumn="0" w:lastRowLastColumn="0"/>
+            </w:pPr>
+            <w:r>
+              <w:t xml:space="preserve">Mostra il </w:t>
+            </w:r>
+            <w:r>
+              <w:rPr>
+                <w:i/>
+                <w:iCs/>
+              </w:rPr>
+              <w:t>disk usage</w:t>
+            </w:r>
+            <w:r>
+              <w:t xml:space="preserve"> dei file nella working directory o di un file se specificato</w:t>
+            </w:r>
+          </w:p>
+        </w:tc>
+      </w:tr>
     </w:tbl>
     <w:p/>
     <w:p>
       <w:r>
+        <w:t>Altri comandi sono elencati nel corso del documento.</w:t>
+      </w:r>
+      <w:r>
+        <w:br/>
+      </w:r>
+      <w:r>
         <w:t>Ad</w:t>
       </w:r>
       <w:r>
@@ -2527,19 +2654,88 @@
         <w:tab/>
         <w:t>visita ricorsivamente le sottodirectory</w:t>
       </w:r>
-      <w:r>
-        <w:rPr>
-          <w:iCs/>
-        </w:rPr>
-        <w:br/>
-      </w:r>
     </w:p>
     <w:p>
       <w:pPr>
+        <w:rPr>
+          <w:iCs/>
+        </w:rPr>
+      </w:pPr>
+      <w:r>
+        <w:rPr>
+          <w:iCs/>
+        </w:rPr>
+        <w:t xml:space="preserve">Eseguendo il comando “ </w:t>
+      </w:r>
+      <w:r>
+        <w:rPr>
+          <w:i/>
+        </w:rPr>
+        <w:t>ls -l ”</w:t>
+      </w:r>
+      <w:r>
+        <w:rPr>
+          <w:iCs/>
+        </w:rPr>
+        <w:t xml:space="preserve">  si ottiene il contenuto della directory corrente listato, con tutte le informazioni aggiuntive:</w:t>
+      </w:r>
+    </w:p>
+    <w:p>
+      <w:pPr>
+        <w:jc w:val="center"/>
+        <w:rPr>
+          <w:iCs/>
+        </w:rPr>
+      </w:pPr>
+      <w:r>
+        <w:rPr>
+          <w:iCs/>
+          <w:noProof/>
+        </w:rPr>
+        <w:drawing>
+          <wp:inline distT="0" distB="0" distL="0" distR="0" wp14:anchorId="59EB78B2" wp14:editId="423CB2F0">
+            <wp:extent cx="5952066" cy="3418826"/>
+            <wp:effectExtent l="0" t="0" r="0" b="0"/>
+            <wp:docPr id="924842744" name="Immagine 1" descr="Immagine che contiene testo, schermata, Carattere, numero&#10;&#10;Descrizione generata automaticamente"/>
+            <wp:cNvGraphicFramePr>
+              <a:graphicFrameLocks xmlns:a="http://schemas.openxmlformats.org/drawingml/2006/main" noChangeAspect="1"/>
+            </wp:cNvGraphicFramePr>
+            <a:graphic xmlns:a="http://schemas.openxmlformats.org/drawingml/2006/main">
+              <a:graphicData uri="http://schemas.openxmlformats.org/drawingml/2006/picture">
+                <pic:pic xmlns:pic="http://schemas.openxmlformats.org/drawingml/2006/picture">
+                  <pic:nvPicPr>
+                    <pic:cNvPr id="924842744" name="Immagine 1" descr="Immagine che contiene testo, schermata, Carattere, numero&#10;&#10;Descrizione generata automaticamente"/>
+                    <pic:cNvPicPr/>
+                  </pic:nvPicPr>
+                  <pic:blipFill>
+                    <a:blip r:embed="rId10"/>
+                    <a:stretch>
+                      <a:fillRect/>
+                    </a:stretch>
+                  </pic:blipFill>
+                  <pic:spPr>
+                    <a:xfrm>
+                      <a:off x="0" y="0"/>
+                      <a:ext cx="5973822" cy="3431322"/>
+                    </a:xfrm>
+                    <a:prstGeom prst="rect">
+                      <a:avLst/>
+                    </a:prstGeom>
+                  </pic:spPr>
+                </pic:pic>
+              </a:graphicData>
+            </a:graphic>
+          </wp:inline>
+        </w:drawing>
+      </w:r>
+    </w:p>
+    <w:p>
+      <w:pPr>
         <w:pStyle w:val="Titolo2"/>
       </w:pPr>
-      <w:bookmarkStart w:id="5" w:name="_Toc179919950"/>
-      <w:r>
+      <w:bookmarkStart w:id="5" w:name="_Toc180065569"/>
+      <w:r>
+        <w:lastRenderedPageBreak/>
         <w:t>1.2 Tipi di file</w:t>
       </w:r>
       <w:bookmarkEnd w:id="5"/>
@@ -2829,7 +3025,6 @@
     </w:p>
     <w:p>
       <w:r>
-        <w:lastRenderedPageBreak/>
         <w:t xml:space="preserve">Se un </w:t>
       </w:r>
       <w:r>
@@ -2976,54 +3171,26 @@
       <w:r>
         <w:t>, che ha come nome lo username del proprietario: è possibile aggiungere files o subdirectory.</w:t>
       </w:r>
+      <w:r>
+        <w:br/>
+      </w:r>
     </w:p>
     <w:p>
       <w:pPr>
-        <w:pStyle w:val="Titolo1"/>
-      </w:pPr>
-      <w:bookmarkStart w:id="6" w:name="_Toc179919951"/>
-      <w:r>
-        <w:t xml:space="preserve">2. </w:t>
-      </w:r>
-      <w:r>
-        <w:t>[</w:t>
-      </w:r>
-      <w:r>
-        <w:t>LEZIONE 2</w:t>
-      </w:r>
-      <w:r>
-        <w:t>]</w:t>
-      </w:r>
-      <w:r>
-        <w:t xml:space="preserve"> </w:t>
-      </w:r>
-      <w:r>
-        <w:t>[</w:t>
-      </w:r>
-      <w:r>
-        <w:t>BETA</w:t>
-      </w:r>
-      <w:r>
-        <w:t>]</w:t>
+        <w:pStyle w:val="Titolo2"/>
+      </w:pPr>
+      <w:bookmarkStart w:id="6" w:name="_Toc180065570"/>
+      <w:r>
+        <w:t>1.3 Protezione file</w:t>
       </w:r>
       <w:bookmarkEnd w:id="6"/>
+      <w:r>
+        <w:t xml:space="preserve"> e Permessi</w:t>
+      </w:r>
     </w:p>
     <w:p>
       <w:r>
-        <w:t xml:space="preserve">Un </w:t>
-      </w:r>
-      <w:r>
-        <w:rPr>
-          <w:i/>
-          <w:iCs/>
-        </w:rPr>
-        <w:t>File System</w:t>
-      </w:r>
-      <w:r>
-        <w:t xml:space="preserve"> Unix è se</w:t>
-      </w:r>
-      <w:r>
-        <w:t>mpre unico, ma può avere parti residenti su device rimuovibili:</w:t>
+        <w:t>Ad ogni file (di qualsiasi tipo) sono associati degli attributi, quali:</w:t>
       </w:r>
     </w:p>
     <w:p>
@@ -3031,21 +3198,17 @@
         <w:pStyle w:val="Paragrafoelenco"/>
         <w:numPr>
           <w:ilvl w:val="0"/>
-          <w:numId w:val="50"/>
+          <w:numId w:val="54"/>
         </w:numPr>
       </w:pPr>
       <w:r>
-        <w:t xml:space="preserve">“montate” prima di potervi accedere (comando </w:t>
-      </w:r>
-      <w:r>
-        <w:rPr>
-          <w:i/>
-          <w:iCs/>
-        </w:rPr>
-        <w:t>mount</w:t>
-      </w:r>
-      <w:r>
-        <w:t>)</w:t>
+        <w:rPr>
+          <w:b/>
+        </w:rPr>
+        <w:t>Proprietario (owner)</w:t>
+      </w:r>
+      <w:r>
+        <w:t>: l’utente che ha creato il file.</w:t>
       </w:r>
     </w:p>
     <w:p>
@@ -3053,37 +3216,464 @@
         <w:pStyle w:val="Paragrafoelenco"/>
         <w:numPr>
           <w:ilvl w:val="0"/>
-          <w:numId w:val="50"/>
+          <w:numId w:val="54"/>
         </w:numPr>
       </w:pPr>
       <w:r>
-        <w:t xml:space="preserve">“smontate” prima di rimuovere il supporto (comando </w:t>
+        <w:rPr>
+          <w:b/>
+        </w:rPr>
+        <w:t>Gruppo (group)</w:t>
+      </w:r>
+      <w:r>
+        <w:t>:</w:t>
+      </w:r>
+      <w:r>
+        <w:t xml:space="preserve"> il gruppo a cui il proprietario appartiene.</w:t>
+      </w:r>
+    </w:p>
+    <w:p>
+      <w:pPr>
+        <w:pStyle w:val="Paragrafoelenco"/>
+        <w:numPr>
+          <w:ilvl w:val="0"/>
+          <w:numId w:val="54"/>
+        </w:numPr>
+      </w:pPr>
+      <w:r>
+        <w:rPr>
+          <w:b/>
+        </w:rPr>
+        <w:t>Permessi (permissions)</w:t>
+      </w:r>
+      <w:r>
+        <w:t>:</w:t>
+      </w:r>
+      <w:r>
+        <w:t xml:space="preserve"> il tipo di operazione che il proprietario, i membri del suo gruppo o altri utenti possono effettuare su quel file.</w:t>
+      </w:r>
+    </w:p>
+    <w:p>
+      <w:r>
+        <w:t>Questi attributi sono assegnati automaticamente dal sistema al momento della creazione del file; possono essere modificati dal proprietario con appositi comandi (</w:t>
       </w:r>
       <w:r>
         <w:rPr>
           <w:i/>
           <w:iCs/>
         </w:rPr>
-        <w:t>unmount</w:t>
-      </w:r>
-      <w:r>
-        <w:t>)</w:t>
-      </w:r>
-    </w:p>
-    <w:p/>
-    <w:p/>
-    <w:p>
-      <w:r>
-        <w:t>Chown cambia owner, chgrp cambia gruppo, chmod cambia i permessi.</w:t>
+        <w:t>chown, chgrp, chmod</w:t>
+      </w:r>
+      <w:r>
+        <w:t>).</w:t>
       </w:r>
     </w:p>
     <w:p>
+      <w:pPr>
+        <w:rPr>
+          <w:iCs/>
+        </w:rPr>
+      </w:pPr>
+      <w:r>
+        <w:t xml:space="preserve">Ogni utente viene identificato da uno </w:t>
+      </w:r>
+      <w:r>
+        <w:rPr>
+          <w:b/>
+          <w:i/>
+          <w:iCs/>
+        </w:rPr>
+        <w:t>username</w:t>
+      </w:r>
+      <w:r>
+        <w:rPr>
+          <w:b/>
+          <w:iCs/>
+        </w:rPr>
+        <w:t xml:space="preserve"> </w:t>
+      </w:r>
+      <w:r>
+        <w:rPr>
+          <w:iCs/>
+        </w:rPr>
+        <w:t xml:space="preserve">assegnato dall’amministratore del sistema; ad ogni </w:t>
+      </w:r>
+      <w:r>
+        <w:rPr>
+          <w:i/>
+        </w:rPr>
+        <w:t>username</w:t>
+      </w:r>
+      <w:r>
+        <w:rPr>
+          <w:iCs/>
+        </w:rPr>
+        <w:t xml:space="preserve"> corrisponde biunivocamente uno </w:t>
+      </w:r>
+      <w:r>
+        <w:rPr>
+          <w:b/>
+          <w:i/>
+          <w:iCs/>
+        </w:rPr>
+        <w:t>userid</w:t>
+      </w:r>
+      <w:r>
+        <w:rPr>
+          <w:iCs/>
+        </w:rPr>
+        <w:t xml:space="preserve"> numerico, assegnato dal sistema. Entrambi (</w:t>
+      </w:r>
+      <w:r>
+        <w:rPr>
+          <w:i/>
+        </w:rPr>
+        <w:t>username e userid</w:t>
+      </w:r>
+      <w:r>
+        <w:rPr>
+          <w:iCs/>
+        </w:rPr>
+        <w:t>) sono pubblici.</w:t>
+      </w:r>
+    </w:p>
+    <w:p>
+      <w:pPr>
+        <w:rPr>
+          <w:iCs/>
+        </w:rPr>
+      </w:pPr>
+      <w:r>
+        <w:rPr>
+          <w:iCs/>
+        </w:rPr>
+        <w:lastRenderedPageBreak/>
+        <w:t xml:space="preserve">Ogni utente può far parte di uno o più </w:t>
+      </w:r>
+      <w:r>
+        <w:rPr>
+          <w:bCs/>
+          <w:iCs/>
+        </w:rPr>
+        <w:t>gruppi</w:t>
+      </w:r>
+      <w:r>
+        <w:rPr>
+          <w:iCs/>
+        </w:rPr>
+        <w:t>, definiti dall’a</w:t>
+      </w:r>
+      <w:r>
+        <w:rPr>
+          <w:iCs/>
+        </w:rPr>
+        <w:t>dmin</w:t>
+      </w:r>
+      <w:r>
+        <w:rPr>
+          <w:iCs/>
+        </w:rPr>
+        <w:t xml:space="preserve"> di sistema: ogni </w:t>
+      </w:r>
+      <w:r>
+        <w:rPr>
+          <w:iCs/>
+        </w:rPr>
+        <w:t>:</w:t>
+      </w:r>
+      <w:r>
+        <w:rPr>
+          <w:iCs/>
+        </w:rPr>
+        <w:t xml:space="preserve">gruppo è identificato da un </w:t>
+      </w:r>
+      <w:r>
+        <w:rPr>
+          <w:b/>
+          <w:i/>
+          <w:iCs/>
+        </w:rPr>
+        <w:t xml:space="preserve">group name </w:t>
+      </w:r>
+      <w:r>
+        <w:rPr>
+          <w:iCs/>
+        </w:rPr>
+        <w:t xml:space="preserve">di massimo 8 caratteri, a cui è associato un </w:t>
+      </w:r>
+      <w:r>
+        <w:rPr>
+          <w:b/>
+          <w:i/>
+          <w:iCs/>
+        </w:rPr>
+        <w:t>groupid</w:t>
+      </w:r>
+      <w:r>
+        <w:rPr>
+          <w:iCs/>
+        </w:rPr>
+        <w:t xml:space="preserve"> numerico.</w:t>
+      </w:r>
+      <w:r>
+        <w:rPr>
+          <w:iCs/>
+        </w:rPr>
+        <w:t xml:space="preserve"> </w:t>
+      </w:r>
+    </w:p>
+    <w:p>
       <w:r>
         <w:t>Possono esistere gruppi vuoti ma mai utenti che non hanno un gruppo di appartenenza.</w:t>
+      </w:r>
+    </w:p>
+    <w:p>
+      <w:r>
+        <w:drawing>
+          <wp:anchor distT="0" distB="0" distL="114300" distR="114300" simplePos="0" relativeHeight="251659264" behindDoc="0" locked="0" layoutInCell="1" allowOverlap="1" wp14:anchorId="738B3815" wp14:editId="0F8D5545">
+            <wp:simplePos x="0" y="0"/>
+            <wp:positionH relativeFrom="margin">
+              <wp:posOffset>3566209</wp:posOffset>
+            </wp:positionH>
+            <wp:positionV relativeFrom="paragraph">
+              <wp:posOffset>140123</wp:posOffset>
+            </wp:positionV>
+            <wp:extent cx="2452208" cy="898314"/>
+            <wp:effectExtent l="19050" t="19050" r="24765" b="16510"/>
+            <wp:wrapNone/>
+            <wp:docPr id="322254897" name="Immagine 1" descr="Immagine che contiene testo, diagramma, linea, schermata&#10;&#10;Descrizione generata automaticamente"/>
+            <wp:cNvGraphicFramePr>
+              <a:graphicFrameLocks xmlns:a="http://schemas.openxmlformats.org/drawingml/2006/main" noChangeAspect="1"/>
+            </wp:cNvGraphicFramePr>
+            <a:graphic xmlns:a="http://schemas.openxmlformats.org/drawingml/2006/main">
+              <a:graphicData uri="http://schemas.openxmlformats.org/drawingml/2006/picture">
+                <pic:pic xmlns:pic="http://schemas.openxmlformats.org/drawingml/2006/picture">
+                  <pic:nvPicPr>
+                    <pic:cNvPr id="322254897" name="Immagine 1" descr="Immagine che contiene testo, diagramma, linea, schermata&#10;&#10;Descrizione generata automaticamente"/>
+                    <pic:cNvPicPr/>
+                  </pic:nvPicPr>
+                  <pic:blipFill>
+                    <a:blip r:embed="rId11">
+                      <a:extLst>
+                        <a:ext uri="{28A0092B-C50C-407E-A947-70E740481C1C}">
+                          <a14:useLocalDpi xmlns:a14="http://schemas.microsoft.com/office/drawing/2010/main" val="0"/>
+                        </a:ext>
+                      </a:extLst>
+                    </a:blip>
+                    <a:stretch>
+                      <a:fillRect/>
+                    </a:stretch>
+                  </pic:blipFill>
+                  <pic:spPr>
+                    <a:xfrm>
+                      <a:off x="0" y="0"/>
+                      <a:ext cx="2452208" cy="898314"/>
+                    </a:xfrm>
+                    <a:prstGeom prst="rect">
+                      <a:avLst/>
+                    </a:prstGeom>
+                    <a:ln>
+                      <a:solidFill>
+                        <a:schemeClr val="tx1"/>
+                      </a:solidFill>
+                    </a:ln>
+                  </pic:spPr>
+                </pic:pic>
+              </a:graphicData>
+            </a:graphic>
+            <wp14:sizeRelH relativeFrom="margin">
+              <wp14:pctWidth>0</wp14:pctWidth>
+            </wp14:sizeRelH>
+            <wp14:sizeRelV relativeFrom="margin">
+              <wp14:pctHeight>0</wp14:pctHeight>
+            </wp14:sizeRelV>
+          </wp:anchor>
+        </w:drawing>
+      </w:r>
+      <w:r>
+        <w:t>Ad un file possono essere attribuiti i seguenti permessi:</w:t>
+      </w:r>
+      <w:r>
+        <w:br/>
+      </w:r>
+      <w:r>
+        <w:rPr>
+          <w:b/>
+        </w:rPr>
+        <w:br/>
+      </w:r>
+      <w:r>
+        <w:rPr>
+          <w:b/>
+        </w:rPr>
+        <w:tab/>
+      </w:r>
+      <w:r>
+        <w:rPr>
+          <w:b/>
+        </w:rPr>
+        <w:t>r</w:t>
+      </w:r>
+      <w:r>
+        <w:tab/>
+        <w:t xml:space="preserve">&gt;  readable </w:t>
+      </w:r>
+      <w:r>
+        <w:rPr>
+          <w:b/>
+        </w:rPr>
+        <w:br/>
+      </w:r>
+      <w:r>
+        <w:rPr>
+          <w:b/>
+        </w:rPr>
+        <w:tab/>
+      </w:r>
+      <w:r>
+        <w:rPr>
+          <w:b/>
+        </w:rPr>
+        <w:t xml:space="preserve">w </w:t>
+      </w:r>
+      <w:r>
+        <w:tab/>
+        <w:t>&gt;  writable</w:t>
+      </w:r>
+      <w:r>
+        <w:rPr>
+          <w:b/>
+        </w:rPr>
+        <w:br/>
+      </w:r>
+      <w:r>
+        <w:rPr>
+          <w:b/>
+        </w:rPr>
+        <w:tab/>
+      </w:r>
+      <w:r>
+        <w:rPr>
+          <w:b/>
+        </w:rPr>
+        <w:t xml:space="preserve">x </w:t>
+      </w:r>
+      <w:r>
+        <w:tab/>
+        <w:t>&gt;  executable</w:t>
+      </w:r>
+      <w:r>
+        <w:rPr>
+          <w:noProof/>
+        </w:rPr>
+        <w:t xml:space="preserve"> </w:t>
+      </w:r>
+      <w:r>
+        <w:br/>
+      </w:r>
+      <w:r>
+        <w:br/>
+      </w:r>
+      <w:r>
+        <w:t>Per l’assegnazione dei permessi, nel sistema Unix sono identificati come:</w:t>
+      </w:r>
+    </w:p>
+    <w:p>
+      <w:r>
+        <w:t>permessi:</w:t>
+      </w:r>
+      <w:r>
+        <w:tab/>
+      </w:r>
+      <w:r>
+        <w:tab/>
+        <w:t>( r  -  - )</w:t>
+      </w:r>
+      <w:r>
+        <w:tab/>
+      </w:r>
+      <w:r>
+        <w:tab/>
+        <w:t>( r  w  - )</w:t>
+      </w:r>
+      <w:r>
+        <w:tab/>
+        <w:t>( r  w  x )</w:t>
+      </w:r>
+      <w:r>
+        <w:br/>
+      </w:r>
+      <w:r>
+        <w:t>in binario:</w:t>
+      </w:r>
+      <w:r>
+        <w:t xml:space="preserve">   </w:t>
+      </w:r>
+      <w:r>
+        <w:tab/>
+      </w:r>
+      <w:r>
+        <w:tab/>
+        <w:t xml:space="preserve">   </w:t>
+      </w:r>
+      <w:r>
+        <w:t>100</w:t>
+      </w:r>
+      <w:r>
+        <w:tab/>
+      </w:r>
+      <w:r>
+        <w:tab/>
+        <w:t xml:space="preserve">    110</w:t>
+      </w:r>
+      <w:r>
+        <w:tab/>
+      </w:r>
+      <w:r>
+        <w:tab/>
+        <w:t xml:space="preserve">    111</w:t>
+      </w:r>
+      <w:r>
+        <w:br/>
+      </w:r>
+      <w:r>
+        <w:t>in ottale:</w:t>
+      </w:r>
+      <w:r>
+        <w:t xml:space="preserve">     </w:t>
+      </w:r>
+      <w:r>
+        <w:tab/>
+      </w:r>
+      <w:r>
+        <w:tab/>
+        <w:t xml:space="preserve">     </w:t>
+      </w:r>
+      <w:r>
+        <w:t>4</w:t>
+      </w:r>
+      <w:r>
+        <w:tab/>
+      </w:r>
+      <w:r>
+        <w:tab/>
+        <w:t xml:space="preserve">      6</w:t>
+      </w:r>
+      <w:r>
+        <w:tab/>
+      </w:r>
+      <w:r>
+        <w:tab/>
+        <w:t xml:space="preserve">      7</w:t>
+      </w:r>
+    </w:p>
+    <w:p>
+      <w:r>
+        <w:t>I comandi Unix utilizzabili per modifiche a permessi, proprietario e gruppi sono:</w:t>
       </w:r>
     </w:p>
     <w:sectPr>
-      <w:footerReference w:type="default" r:id="rId10"/>
+      <w:footerReference w:type="default" r:id="rId12"/>
       <w:pgSz w:w="11906" w:h="16838"/>
       <w:pgMar w:top="1417" w:right="1134" w:bottom="1134" w:left="1134" w:header="708" w:footer="708" w:gutter="0"/>
       <w:cols w:space="708"/>
@@ -6342,6 +6932,119 @@
     </w:lvl>
   </w:abstractNum>
   <w:abstractNum w:abstractNumId="28" w15:restartNumberingAfterBreak="0">
+    <w:nsid w:val="3DBC2896"/>
+    <w:multiLevelType w:val="hybridMultilevel"/>
+    <w:tmpl w:val="767C1268"/>
+    <w:lvl w:ilvl="0" w:tplc="04100001">
+      <w:start w:val="1"/>
+      <w:numFmt w:val="bullet"/>
+      <w:lvlText w:val=""/>
+      <w:lvlJc w:val="left"/>
+      <w:pPr>
+        <w:ind w:left="720" w:hanging="360"/>
+      </w:pPr>
+      <w:rPr>
+        <w:rFonts w:ascii="Symbol" w:hAnsi="Symbol" w:hint="default"/>
+      </w:rPr>
+    </w:lvl>
+    <w:lvl w:ilvl="1" w:tplc="04100003" w:tentative="1">
+      <w:start w:val="1"/>
+      <w:numFmt w:val="bullet"/>
+      <w:lvlText w:val="o"/>
+      <w:lvlJc w:val="left"/>
+      <w:pPr>
+        <w:ind w:left="1440" w:hanging="360"/>
+      </w:pPr>
+      <w:rPr>
+        <w:rFonts w:ascii="Courier New" w:hAnsi="Courier New" w:cs="Courier New" w:hint="default"/>
+      </w:rPr>
+    </w:lvl>
+    <w:lvl w:ilvl="2" w:tplc="04100005" w:tentative="1">
+      <w:start w:val="1"/>
+      <w:numFmt w:val="bullet"/>
+      <w:lvlText w:val=""/>
+      <w:lvlJc w:val="left"/>
+      <w:pPr>
+        <w:ind w:left="2160" w:hanging="360"/>
+      </w:pPr>
+      <w:rPr>
+        <w:rFonts w:ascii="Wingdings" w:hAnsi="Wingdings" w:hint="default"/>
+      </w:rPr>
+    </w:lvl>
+    <w:lvl w:ilvl="3" w:tplc="04100001" w:tentative="1">
+      <w:start w:val="1"/>
+      <w:numFmt w:val="bullet"/>
+      <w:lvlText w:val=""/>
+      <w:lvlJc w:val="left"/>
+      <w:pPr>
+        <w:ind w:left="2880" w:hanging="360"/>
+      </w:pPr>
+      <w:rPr>
+        <w:rFonts w:ascii="Symbol" w:hAnsi="Symbol" w:hint="default"/>
+      </w:rPr>
+    </w:lvl>
+    <w:lvl w:ilvl="4" w:tplc="04100003" w:tentative="1">
+      <w:start w:val="1"/>
+      <w:numFmt w:val="bullet"/>
+      <w:lvlText w:val="o"/>
+      <w:lvlJc w:val="left"/>
+      <w:pPr>
+        <w:ind w:left="3600" w:hanging="360"/>
+      </w:pPr>
+      <w:rPr>
+        <w:rFonts w:ascii="Courier New" w:hAnsi="Courier New" w:cs="Courier New" w:hint="default"/>
+      </w:rPr>
+    </w:lvl>
+    <w:lvl w:ilvl="5" w:tplc="04100005" w:tentative="1">
+      <w:start w:val="1"/>
+      <w:numFmt w:val="bullet"/>
+      <w:lvlText w:val=""/>
+      <w:lvlJc w:val="left"/>
+      <w:pPr>
+        <w:ind w:left="4320" w:hanging="360"/>
+      </w:pPr>
+      <w:rPr>
+        <w:rFonts w:ascii="Wingdings" w:hAnsi="Wingdings" w:hint="default"/>
+      </w:rPr>
+    </w:lvl>
+    <w:lvl w:ilvl="6" w:tplc="04100001" w:tentative="1">
+      <w:start w:val="1"/>
+      <w:numFmt w:val="bullet"/>
+      <w:lvlText w:val=""/>
+      <w:lvlJc w:val="left"/>
+      <w:pPr>
+        <w:ind w:left="5040" w:hanging="360"/>
+      </w:pPr>
+      <w:rPr>
+        <w:rFonts w:ascii="Symbol" w:hAnsi="Symbol" w:hint="default"/>
+      </w:rPr>
+    </w:lvl>
+    <w:lvl w:ilvl="7" w:tplc="04100003" w:tentative="1">
+      <w:start w:val="1"/>
+      <w:numFmt w:val="bullet"/>
+      <w:lvlText w:val="o"/>
+      <w:lvlJc w:val="left"/>
+      <w:pPr>
+        <w:ind w:left="5760" w:hanging="360"/>
+      </w:pPr>
+      <w:rPr>
+        <w:rFonts w:ascii="Courier New" w:hAnsi="Courier New" w:cs="Courier New" w:hint="default"/>
+      </w:rPr>
+    </w:lvl>
+    <w:lvl w:ilvl="8" w:tplc="04100005" w:tentative="1">
+      <w:start w:val="1"/>
+      <w:numFmt w:val="bullet"/>
+      <w:lvlText w:val=""/>
+      <w:lvlJc w:val="left"/>
+      <w:pPr>
+        <w:ind w:left="6480" w:hanging="360"/>
+      </w:pPr>
+      <w:rPr>
+        <w:rFonts w:ascii="Wingdings" w:hAnsi="Wingdings" w:hint="default"/>
+      </w:rPr>
+    </w:lvl>
+  </w:abstractNum>
+  <w:abstractNum w:abstractNumId="29" w15:restartNumberingAfterBreak="0">
     <w:nsid w:val="42E6267A"/>
     <w:multiLevelType w:val="hybridMultilevel"/>
     <w:tmpl w:val="A8B26920"/>
@@ -6454,7 +7157,7 @@
       </w:rPr>
     </w:lvl>
   </w:abstractNum>
-  <w:abstractNum w:abstractNumId="29" w15:restartNumberingAfterBreak="0">
+  <w:abstractNum w:abstractNumId="30" w15:restartNumberingAfterBreak="0">
     <w:nsid w:val="47721F6B"/>
     <w:multiLevelType w:val="hybridMultilevel"/>
     <w:tmpl w:val="22AA14E6"/>
@@ -6567,7 +7270,7 @@
       </w:rPr>
     </w:lvl>
   </w:abstractNum>
-  <w:abstractNum w:abstractNumId="30" w15:restartNumberingAfterBreak="0">
+  <w:abstractNum w:abstractNumId="31" w15:restartNumberingAfterBreak="0">
     <w:nsid w:val="49E928DB"/>
     <w:multiLevelType w:val="hybridMultilevel"/>
     <w:tmpl w:val="01DCA99A"/>
@@ -6680,7 +7383,7 @@
       </w:rPr>
     </w:lvl>
   </w:abstractNum>
-  <w:abstractNum w:abstractNumId="31" w15:restartNumberingAfterBreak="0">
+  <w:abstractNum w:abstractNumId="32" w15:restartNumberingAfterBreak="0">
     <w:nsid w:val="508E2E07"/>
     <w:multiLevelType w:val="hybridMultilevel"/>
     <w:tmpl w:val="075C9D0C"/>
@@ -6793,7 +7496,7 @@
       </w:rPr>
     </w:lvl>
   </w:abstractNum>
-  <w:abstractNum w:abstractNumId="32" w15:restartNumberingAfterBreak="0">
+  <w:abstractNum w:abstractNumId="33" w15:restartNumberingAfterBreak="0">
     <w:nsid w:val="50ED4DF0"/>
     <w:multiLevelType w:val="hybridMultilevel"/>
     <w:tmpl w:val="492C90A2"/>
@@ -6906,7 +7609,7 @@
       </w:rPr>
     </w:lvl>
   </w:abstractNum>
-  <w:abstractNum w:abstractNumId="33" w15:restartNumberingAfterBreak="0">
+  <w:abstractNum w:abstractNumId="34" w15:restartNumberingAfterBreak="0">
     <w:nsid w:val="562B70AB"/>
     <w:multiLevelType w:val="hybridMultilevel"/>
     <w:tmpl w:val="2552308C"/>
@@ -7019,7 +7722,7 @@
       </w:rPr>
     </w:lvl>
   </w:abstractNum>
-  <w:abstractNum w:abstractNumId="34" w15:restartNumberingAfterBreak="0">
+  <w:abstractNum w:abstractNumId="35" w15:restartNumberingAfterBreak="0">
     <w:nsid w:val="583646D3"/>
     <w:multiLevelType w:val="hybridMultilevel"/>
     <w:tmpl w:val="C1D2436E"/>
@@ -7132,7 +7835,7 @@
       </w:rPr>
     </w:lvl>
   </w:abstractNum>
-  <w:abstractNum w:abstractNumId="35" w15:restartNumberingAfterBreak="0">
+  <w:abstractNum w:abstractNumId="36" w15:restartNumberingAfterBreak="0">
     <w:nsid w:val="585E6901"/>
     <w:multiLevelType w:val="hybridMultilevel"/>
     <w:tmpl w:val="4C805D4A"/>
@@ -7245,7 +7948,7 @@
       </w:rPr>
     </w:lvl>
   </w:abstractNum>
-  <w:abstractNum w:abstractNumId="36" w15:restartNumberingAfterBreak="0">
+  <w:abstractNum w:abstractNumId="37" w15:restartNumberingAfterBreak="0">
     <w:nsid w:val="58A04815"/>
     <w:multiLevelType w:val="hybridMultilevel"/>
     <w:tmpl w:val="23722966"/>
@@ -7358,7 +8061,7 @@
       </w:rPr>
     </w:lvl>
   </w:abstractNum>
-  <w:abstractNum w:abstractNumId="37" w15:restartNumberingAfterBreak="0">
+  <w:abstractNum w:abstractNumId="38" w15:restartNumberingAfterBreak="0">
     <w:nsid w:val="5B97746A"/>
     <w:multiLevelType w:val="hybridMultilevel"/>
     <w:tmpl w:val="C9C40FE0"/>
@@ -7471,7 +8174,7 @@
       </w:rPr>
     </w:lvl>
   </w:abstractNum>
-  <w:abstractNum w:abstractNumId="38" w15:restartNumberingAfterBreak="0">
+  <w:abstractNum w:abstractNumId="39" w15:restartNumberingAfterBreak="0">
     <w:nsid w:val="5C5E3D8C"/>
     <w:multiLevelType w:val="hybridMultilevel"/>
     <w:tmpl w:val="B97097DC"/>
@@ -7584,7 +8287,7 @@
       </w:rPr>
     </w:lvl>
   </w:abstractNum>
-  <w:abstractNum w:abstractNumId="39" w15:restartNumberingAfterBreak="0">
+  <w:abstractNum w:abstractNumId="40" w15:restartNumberingAfterBreak="0">
     <w:nsid w:val="62406EA7"/>
     <w:multiLevelType w:val="hybridMultilevel"/>
     <w:tmpl w:val="B192C9F8"/>
@@ -7697,7 +8400,7 @@
       </w:rPr>
     </w:lvl>
   </w:abstractNum>
-  <w:abstractNum w:abstractNumId="40" w15:restartNumberingAfterBreak="0">
+  <w:abstractNum w:abstractNumId="41" w15:restartNumberingAfterBreak="0">
     <w:nsid w:val="63DE7B75"/>
     <w:multiLevelType w:val="hybridMultilevel"/>
     <w:tmpl w:val="301AA7F2"/>
@@ -7810,7 +8513,7 @@
       </w:rPr>
     </w:lvl>
   </w:abstractNum>
-  <w:abstractNum w:abstractNumId="41" w15:restartNumberingAfterBreak="0">
+  <w:abstractNum w:abstractNumId="42" w15:restartNumberingAfterBreak="0">
     <w:nsid w:val="658A1D16"/>
     <w:multiLevelType w:val="hybridMultilevel"/>
     <w:tmpl w:val="FDA4205E"/>
@@ -7923,7 +8626,7 @@
       </w:rPr>
     </w:lvl>
   </w:abstractNum>
-  <w:abstractNum w:abstractNumId="42" w15:restartNumberingAfterBreak="0">
+  <w:abstractNum w:abstractNumId="43" w15:restartNumberingAfterBreak="0">
     <w:nsid w:val="65954A2D"/>
     <w:multiLevelType w:val="hybridMultilevel"/>
     <w:tmpl w:val="EBC0BF0E"/>
@@ -8036,7 +8739,7 @@
       </w:rPr>
     </w:lvl>
   </w:abstractNum>
-  <w:abstractNum w:abstractNumId="43" w15:restartNumberingAfterBreak="0">
+  <w:abstractNum w:abstractNumId="44" w15:restartNumberingAfterBreak="0">
     <w:nsid w:val="65D14F79"/>
     <w:multiLevelType w:val="hybridMultilevel"/>
     <w:tmpl w:val="510214FC"/>
@@ -8149,7 +8852,7 @@
       </w:rPr>
     </w:lvl>
   </w:abstractNum>
-  <w:abstractNum w:abstractNumId="44" w15:restartNumberingAfterBreak="0">
+  <w:abstractNum w:abstractNumId="45" w15:restartNumberingAfterBreak="0">
     <w:nsid w:val="66CE3AF0"/>
     <w:multiLevelType w:val="hybridMultilevel"/>
     <w:tmpl w:val="9BF0B22E"/>
@@ -8262,7 +8965,7 @@
       </w:rPr>
     </w:lvl>
   </w:abstractNum>
-  <w:abstractNum w:abstractNumId="45" w15:restartNumberingAfterBreak="0">
+  <w:abstractNum w:abstractNumId="46" w15:restartNumberingAfterBreak="0">
     <w:nsid w:val="6A9F1F88"/>
     <w:multiLevelType w:val="hybridMultilevel"/>
     <w:tmpl w:val="BCC42004"/>
@@ -8375,7 +9078,7 @@
       </w:rPr>
     </w:lvl>
   </w:abstractNum>
-  <w:abstractNum w:abstractNumId="46" w15:restartNumberingAfterBreak="0">
+  <w:abstractNum w:abstractNumId="47" w15:restartNumberingAfterBreak="0">
     <w:nsid w:val="6B4333FF"/>
     <w:multiLevelType w:val="hybridMultilevel"/>
     <w:tmpl w:val="096844E2"/>
@@ -8488,7 +9191,7 @@
       </w:rPr>
     </w:lvl>
   </w:abstractNum>
-  <w:abstractNum w:abstractNumId="47" w15:restartNumberingAfterBreak="0">
+  <w:abstractNum w:abstractNumId="48" w15:restartNumberingAfterBreak="0">
     <w:nsid w:val="70FB2E55"/>
     <w:multiLevelType w:val="hybridMultilevel"/>
     <w:tmpl w:val="7480CC58"/>
@@ -8601,7 +9304,7 @@
       </w:rPr>
     </w:lvl>
   </w:abstractNum>
-  <w:abstractNum w:abstractNumId="48" w15:restartNumberingAfterBreak="0">
+  <w:abstractNum w:abstractNumId="49" w15:restartNumberingAfterBreak="0">
     <w:nsid w:val="72417D20"/>
     <w:multiLevelType w:val="hybridMultilevel"/>
     <w:tmpl w:val="1A02FD1C"/>
@@ -8714,7 +9417,7 @@
       </w:rPr>
     </w:lvl>
   </w:abstractNum>
-  <w:abstractNum w:abstractNumId="49" w15:restartNumberingAfterBreak="0">
+  <w:abstractNum w:abstractNumId="50" w15:restartNumberingAfterBreak="0">
     <w:nsid w:val="75243390"/>
     <w:multiLevelType w:val="hybridMultilevel"/>
     <w:tmpl w:val="A02E9182"/>
@@ -8827,7 +9530,7 @@
       </w:rPr>
     </w:lvl>
   </w:abstractNum>
-  <w:abstractNum w:abstractNumId="50" w15:restartNumberingAfterBreak="0">
+  <w:abstractNum w:abstractNumId="51" w15:restartNumberingAfterBreak="0">
     <w:nsid w:val="78E377EE"/>
     <w:multiLevelType w:val="hybridMultilevel"/>
     <w:tmpl w:val="4D6476CC"/>
@@ -8940,7 +9643,7 @@
       </w:rPr>
     </w:lvl>
   </w:abstractNum>
-  <w:abstractNum w:abstractNumId="51" w15:restartNumberingAfterBreak="0">
+  <w:abstractNum w:abstractNumId="52" w15:restartNumberingAfterBreak="0">
     <w:nsid w:val="7D6D0127"/>
     <w:multiLevelType w:val="multilevel"/>
     <w:tmpl w:val="B0229FD4"/>
@@ -9053,7 +9756,7 @@
       </w:rPr>
     </w:lvl>
   </w:abstractNum>
-  <w:abstractNum w:abstractNumId="52" w15:restartNumberingAfterBreak="0">
+  <w:abstractNum w:abstractNumId="53" w15:restartNumberingAfterBreak="0">
     <w:nsid w:val="7FCC0BF3"/>
     <w:multiLevelType w:val="hybridMultilevel"/>
     <w:tmpl w:val="5008DC92"/>
@@ -9167,13 +9870,13 @@
     </w:lvl>
   </w:abstractNum>
   <w:num w:numId="1" w16cid:durableId="1743523909">
-    <w:abstractNumId w:val="34"/>
+    <w:abstractNumId w:val="35"/>
   </w:num>
   <w:num w:numId="2" w16cid:durableId="612371807">
     <w:abstractNumId w:val="24"/>
   </w:num>
   <w:num w:numId="3" w16cid:durableId="634601290">
-    <w:abstractNumId w:val="28"/>
+    <w:abstractNumId w:val="29"/>
   </w:num>
   <w:num w:numId="4" w16cid:durableId="1149250743">
     <w:abstractNumId w:val="22"/>
@@ -9197,46 +9900,46 @@
     <w:abstractNumId w:val="26"/>
   </w:num>
   <w:num w:numId="11" w16cid:durableId="1633556597">
-    <w:abstractNumId w:val="48"/>
+    <w:abstractNumId w:val="49"/>
   </w:num>
   <w:num w:numId="12" w16cid:durableId="758790461">
     <w:abstractNumId w:val="10"/>
   </w:num>
   <w:num w:numId="13" w16cid:durableId="1596474835">
-    <w:abstractNumId w:val="42"/>
+    <w:abstractNumId w:val="43"/>
   </w:num>
   <w:num w:numId="14" w16cid:durableId="896475580">
-    <w:abstractNumId w:val="41"/>
+    <w:abstractNumId w:val="42"/>
   </w:num>
   <w:num w:numId="15" w16cid:durableId="151218727">
     <w:abstractNumId w:val="25"/>
   </w:num>
   <w:num w:numId="16" w16cid:durableId="1361012317">
-    <w:abstractNumId w:val="32"/>
+    <w:abstractNumId w:val="33"/>
   </w:num>
   <w:num w:numId="17" w16cid:durableId="1347174226">
-    <w:abstractNumId w:val="43"/>
+    <w:abstractNumId w:val="44"/>
   </w:num>
   <w:num w:numId="18" w16cid:durableId="1463234472">
-    <w:abstractNumId w:val="50"/>
+    <w:abstractNumId w:val="51"/>
   </w:num>
   <w:num w:numId="19" w16cid:durableId="1653950993">
     <w:abstractNumId w:val="21"/>
   </w:num>
   <w:num w:numId="20" w16cid:durableId="1712067604">
-    <w:abstractNumId w:val="46"/>
+    <w:abstractNumId w:val="47"/>
   </w:num>
   <w:num w:numId="21" w16cid:durableId="588972247">
-    <w:abstractNumId w:val="39"/>
+    <w:abstractNumId w:val="40"/>
   </w:num>
   <w:num w:numId="22" w16cid:durableId="956716684">
     <w:abstractNumId w:val="4"/>
   </w:num>
   <w:num w:numId="23" w16cid:durableId="624584093">
-    <w:abstractNumId w:val="52"/>
+    <w:abstractNumId w:val="53"/>
   </w:num>
   <w:num w:numId="24" w16cid:durableId="1384980987">
-    <w:abstractNumId w:val="36"/>
+    <w:abstractNumId w:val="37"/>
   </w:num>
   <w:num w:numId="25" w16cid:durableId="1676109638">
     <w:abstractNumId w:val="17"/>
@@ -9245,10 +9948,10 @@
     <w:abstractNumId w:val="2"/>
   </w:num>
   <w:num w:numId="27" w16cid:durableId="1581060762">
-    <w:abstractNumId w:val="30"/>
+    <w:abstractNumId w:val="31"/>
   </w:num>
   <w:num w:numId="28" w16cid:durableId="844247749">
-    <w:abstractNumId w:val="45"/>
+    <w:abstractNumId w:val="46"/>
   </w:num>
   <w:num w:numId="29" w16cid:durableId="530415048">
     <w:abstractNumId w:val="14"/>
@@ -9260,13 +9963,13 @@
     <w:abstractNumId w:val="8"/>
   </w:num>
   <w:num w:numId="32" w16cid:durableId="147206919">
-    <w:abstractNumId w:val="37"/>
+    <w:abstractNumId w:val="38"/>
   </w:num>
   <w:num w:numId="33" w16cid:durableId="2074035014">
     <w:abstractNumId w:val="15"/>
   </w:num>
   <w:num w:numId="34" w16cid:durableId="1522359720">
-    <w:abstractNumId w:val="31"/>
+    <w:abstractNumId w:val="32"/>
   </w:num>
   <w:num w:numId="35" w16cid:durableId="1541241314">
     <w:abstractNumId w:val="7"/>
@@ -9275,7 +9978,7 @@
     <w:abstractNumId w:val="20"/>
   </w:num>
   <w:num w:numId="37" w16cid:durableId="1187259159">
-    <w:abstractNumId w:val="38"/>
+    <w:abstractNumId w:val="39"/>
   </w:num>
   <w:num w:numId="38" w16cid:durableId="1752047152">
     <w:abstractNumId w:val="27"/>
@@ -9284,22 +9987,22 @@
     <w:abstractNumId w:val="16"/>
   </w:num>
   <w:num w:numId="40" w16cid:durableId="1116754875">
-    <w:abstractNumId w:val="44"/>
+    <w:abstractNumId w:val="45"/>
   </w:num>
   <w:num w:numId="41" w16cid:durableId="573122551">
-    <w:abstractNumId w:val="49"/>
+    <w:abstractNumId w:val="50"/>
   </w:num>
   <w:num w:numId="42" w16cid:durableId="1606693166">
-    <w:abstractNumId w:val="47"/>
+    <w:abstractNumId w:val="48"/>
   </w:num>
   <w:num w:numId="43" w16cid:durableId="1645812648">
     <w:abstractNumId w:val="13"/>
   </w:num>
   <w:num w:numId="44" w16cid:durableId="247932865">
-    <w:abstractNumId w:val="33"/>
+    <w:abstractNumId w:val="34"/>
   </w:num>
   <w:num w:numId="45" w16cid:durableId="1151286981">
-    <w:abstractNumId w:val="29"/>
+    <w:abstractNumId w:val="30"/>
   </w:num>
   <w:num w:numId="46" w16cid:durableId="7219639">
     <w:abstractNumId w:val="9"/>
@@ -9311,19 +10014,22 @@
     <w:abstractNumId w:val="3"/>
   </w:num>
   <w:num w:numId="49" w16cid:durableId="1363168757">
-    <w:abstractNumId w:val="40"/>
+    <w:abstractNumId w:val="41"/>
   </w:num>
   <w:num w:numId="50" w16cid:durableId="274295852">
     <w:abstractNumId w:val="12"/>
   </w:num>
   <w:num w:numId="51" w16cid:durableId="1980844439">
-    <w:abstractNumId w:val="35"/>
+    <w:abstractNumId w:val="36"/>
   </w:num>
   <w:num w:numId="52" w16cid:durableId="1092630366">
     <w:abstractNumId w:val="19"/>
   </w:num>
   <w:num w:numId="53" w16cid:durableId="346831668">
-    <w:abstractNumId w:val="51"/>
+    <w:abstractNumId w:val="52"/>
+  </w:num>
+  <w:num w:numId="54" w16cid:durableId="1075317428">
+    <w:abstractNumId w:val="28"/>
   </w:num>
 </w:numbering>
 </file>
@@ -10191,6 +10897,86 @@
       </w:tcPr>
     </w:tblStylePr>
   </w:style>
+  <w:style w:type="table" w:styleId="Tabellasemplice-2">
+    <w:name w:val="Plain Table 2"/>
+    <w:basedOn w:val="Tabellanormale"/>
+    <w:uiPriority w:val="42"/>
+    <w:rsid w:val="00C044C4"/>
+    <w:pPr>
+      <w:spacing w:after="0" w:line="240" w:lineRule="auto"/>
+    </w:pPr>
+    <w:tblPr>
+      <w:tblStyleRowBandSize w:val="1"/>
+      <w:tblStyleColBandSize w:val="1"/>
+      <w:tblBorders>
+        <w:top w:val="single" w:sz="4" w:space="0" w:color="7F7F7F" w:themeColor="text1" w:themeTint="80"/>
+        <w:bottom w:val="single" w:sz="4" w:space="0" w:color="7F7F7F" w:themeColor="text1" w:themeTint="80"/>
+      </w:tblBorders>
+    </w:tblPr>
+    <w:tblStylePr w:type="firstRow">
+      <w:rPr>
+        <w:b/>
+        <w:bCs/>
+      </w:rPr>
+      <w:tblPr/>
+      <w:tcPr>
+        <w:tcBorders>
+          <w:bottom w:val="single" w:sz="4" w:space="0" w:color="7F7F7F" w:themeColor="text1" w:themeTint="80"/>
+        </w:tcBorders>
+      </w:tcPr>
+    </w:tblStylePr>
+    <w:tblStylePr w:type="lastRow">
+      <w:rPr>
+        <w:b/>
+        <w:bCs/>
+      </w:rPr>
+      <w:tblPr/>
+      <w:tcPr>
+        <w:tcBorders>
+          <w:top w:val="single" w:sz="4" w:space="0" w:color="7F7F7F" w:themeColor="text1" w:themeTint="80"/>
+        </w:tcBorders>
+      </w:tcPr>
+    </w:tblStylePr>
+    <w:tblStylePr w:type="firstCol">
+      <w:rPr>
+        <w:b/>
+        <w:bCs/>
+      </w:rPr>
+    </w:tblStylePr>
+    <w:tblStylePr w:type="lastCol">
+      <w:rPr>
+        <w:b/>
+        <w:bCs/>
+      </w:rPr>
+    </w:tblStylePr>
+    <w:tblStylePr w:type="band1Vert">
+      <w:tblPr/>
+      <w:tcPr>
+        <w:tcBorders>
+          <w:left w:val="single" w:sz="4" w:space="0" w:color="7F7F7F" w:themeColor="text1" w:themeTint="80"/>
+          <w:right w:val="single" w:sz="4" w:space="0" w:color="7F7F7F" w:themeColor="text1" w:themeTint="80"/>
+        </w:tcBorders>
+      </w:tcPr>
+    </w:tblStylePr>
+    <w:tblStylePr w:type="band2Vert">
+      <w:tblPr/>
+      <w:tcPr>
+        <w:tcBorders>
+          <w:left w:val="single" w:sz="4" w:space="0" w:color="7F7F7F" w:themeColor="text1" w:themeTint="80"/>
+          <w:right w:val="single" w:sz="4" w:space="0" w:color="7F7F7F" w:themeColor="text1" w:themeTint="80"/>
+        </w:tcBorders>
+      </w:tcPr>
+    </w:tblStylePr>
+    <w:tblStylePr w:type="band1Horz">
+      <w:tblPr/>
+      <w:tcPr>
+        <w:tcBorders>
+          <w:top w:val="single" w:sz="4" w:space="0" w:color="7F7F7F" w:themeColor="text1" w:themeTint="80"/>
+          <w:bottom w:val="single" w:sz="4" w:space="0" w:color="7F7F7F" w:themeColor="text1" w:themeTint="80"/>
+        </w:tcBorders>
+      </w:tcPr>
+    </w:tblStylePr>
+  </w:style>
 </w:styles>
 </file>
 

</xml_diff>